<commit_message>
docs: update README + report for FastAPI UI, Lightsail deploy, confidence score
</commit_message>
<xml_diff>
--- a/docs/Atlas_Report.docx
+++ b/docs/Atlas_Report.docx
@@ -568,7 +568,7 @@
                 <w:sz w:val="18"/>
                 <w:szCs w:val="18"/>
               </w:rPr>
-              <w:t xml:space="preserve">Fact-check draft vs. sources; loop if weak</w:t>
+              <w:t xml:space="preserve">Fact-check vs. sources; emit confidence score; loop if weak</w:t>
             </w:r>
           </w:p>
         </w:tc>
@@ -928,7 +928,7 @@
         <w:t xml:space="preserve">Container hardening</w:t>
       </w:r>
       <w:r>
-        <w:t xml:space="preserve"> — Dockerfile runs as a non-root user; secrets are App Runner environment variables, never committed.</w:t>
+        <w:t xml:space="preserve"> — the Docker image runs as a non-root user; secrets are injected as Lightsail environment variables, never committed (.env is git-ignored).</w:t>
       </w:r>
     </w:p>
     <w:p>
@@ -951,7 +951,7 @@
         <w:t xml:space="preserve">Stack: </w:t>
       </w:r>
       <w:r>
-        <w:t xml:space="preserve">Python 3.11 · LangGraph (orchestrator) · Anthropic SDK (Claude Sonnet for reasoning, Haiku for cheap classifiers) · Tavily (web search) · Streamlit (UI) · pydantic-settings (typed config) · tenacity (retries) · structlog (audit logs) · bleach (HTML sanitization).</w:t>
+        <w:t xml:space="preserve">Python 3.11 · LangGraph (orchestrator) · Anthropic SDK (Claude Sonnet for reasoning, Haiku for cheap classifiers) · Tavily (web search) · FastAPI + Server-Sent Events with a custom HTML/JS frontend (live-streaming UI) · pydantic-settings (typed config) · tenacity (retries) · structlog (audit logs) · bleach (HTML sanitization).</w:t>
       </w:r>
     </w:p>
     <w:p>
@@ -1026,7 +1026,7 @@
         <w:t xml:space="preserve">Deployment: </w:t>
       </w:r>
       <w:r>
-        <w:t xml:space="preserve">Dockerfile builds a 200 MB image running Streamlit on port 8080. AWS App Runner is the deploy target — a single apprunner.yaml in the repo plus two environment-variable secrets brings up a public HTTPS URL. The non-root user, dependency pinning in pyproject.toml, and .dockerignore prevent secret leakage.</w:t>
+        <w:t xml:space="preserve">The Dockerfile builds an image running uvicorn/FastAPI on port 8080. The deploy target is AWS Lightsail Containers (Oregon): the image is pushed to a public registry, then a Lightsail container service runs it with the two API keys injected as environment variables, exposing a public HTTPS URL with a /healthz health check. The non-root user, dependency pinning in pyproject.toml, and .dockerignore prevent secret leakage.</w:t>
       </w:r>
     </w:p>
     <w:p>
@@ -1074,7 +1074,7 @@
         <w:t xml:space="preserve">Collaboration / negotiation: </w:t>
       </w:r>
       <w:r>
-        <w:t xml:space="preserve">The Critic is an explicit adversarial peer to the Writer. If the Critic identifies more than one unsupported claim it loops back to the Writer with structured issues to address; if the second pass still has issues, the run proceeds but surfaces issues in the security report. This negotiation is bounded — there is no free-form agent chat that could spiral.</w:t>
+        <w:t xml:space="preserve">The Critic is an explicit adversarial peer to the Writer. If the Critic identifies more than one unsupported claim it loops back to the Writer with structured issues to address; if the second pass still has issues, the run proceeds but surfaces them to the user. The Critic also emits a 0–100 confidence score (weighing source grounding, source quantity and agreement, and issues found) that is shown alongside the brief — so the reader sees not just an answer but a calibrated trust signal. This negotiation is bounded — there is no free-form agent chat that could spiral.</w:t>
       </w:r>
     </w:p>
     <w:p>
@@ -1110,7 +1110,7 @@
           <w:sz w:val="18"/>
           <w:szCs w:val="18"/>
         </w:rPr>
-        <w:t xml:space="preserve">github.com/&lt;your-username&gt;/atlas    </w:t>
+        <w:t xml:space="preserve">github.com/manasimathkar/atlas-multi-agent     </w:t>
       </w:r>
       <w:r>
         <w:rPr>
@@ -1126,7 +1126,7 @@
           <w:sz w:val="18"/>
           <w:szCs w:val="18"/>
         </w:rPr>
-        <w:t xml:space="preserve">&lt;App Runner URL — added after deploy&gt;</w:t>
+        <w:t xml:space="preserve">wipro-manasi.jc3b1dk9p8244.us-west-2.cs.amazonlightsail.com</w:t>
       </w:r>
     </w:p>
     <w:sectPr>

</xml_diff>

<commit_message>
docs: remove em dashes from README and report
</commit_message>
<xml_diff>
--- a/docs/Atlas_Report.docx
+++ b/docs/Atlas_Report.docx
@@ -15,7 +15,7 @@
           <w:sz w:val="32"/>
           <w:szCs w:val="32"/>
         </w:rPr>
-        <w:t xml:space="preserve">Atlas — Multi-Agent Research &amp; Brief Generator</w:t>
+        <w:t xml:space="preserve">Atlas: Multi-Agent Research &amp; Brief Generator</w:t>
       </w:r>
     </w:p>
     <w:p>
@@ -25,15 +25,16 @@
       <w:r>
         <w:rPr>
           <w:color w:val="595959"/>
-          <w:sz w:val="18"/>
-          <w:szCs w:val="18"/>
+          <w:sz w:val="20"/>
+          <w:szCs w:val="20"/>
         </w:rPr>
         <w:t xml:space="preserve">Manasi Mathkar  ·  Wipro Junior FDE Pre-screening Assignment  ·  May 2026</w:t>
       </w:r>
     </w:p>
     <w:p>
       <w:pPr>
-        <w:spacing w:after="80"/>
+        <w:spacing w:after="130" w:line="264"/>
+        <w:jc w:val="both"/>
       </w:pPr>
       <w:r>
         <w:rPr>
@@ -56,10 +57,11 @@
     </w:p>
     <w:p>
       <w:pPr>
-        <w:spacing w:after="80"/>
-      </w:pPr>
-      <w:r>
-        <w:t xml:space="preserve">Five agents are orchestrated as a directed graph with one fan-out (parallel research) and one bounded loop (critic→writer). The graph topology is explicit — the orchestrator is not itself an LLM — which keeps control flow auditable and budget-bounded.</w:t>
+        <w:spacing w:after="130" w:line="264"/>
+        <w:jc w:val="both"/>
+      </w:pPr>
+      <w:r>
+        <w:t xml:space="preserve">Five agents are orchestrated as a directed graph with one fan-out (parallel research) and one bounded loop (critic to writer). The graph topology is explicit (the orchestrator is not itself an LLM), which keeps control flow auditable and budget-bounded.</w:t>
       </w:r>
     </w:p>
     <w:tbl>
@@ -106,8 +108,8 @@
               <w:rPr>
                 <w:b/>
                 <w:bCs/>
-                <w:sz w:val="18"/>
-                <w:szCs w:val="18"/>
+                <w:sz w:val="20"/>
+                <w:szCs w:val="20"/>
               </w:rPr>
               <w:t xml:space="preserve">Agent</w:t>
             </w:r>
@@ -135,8 +137,8 @@
               <w:rPr>
                 <w:b/>
                 <w:bCs/>
-                <w:sz w:val="18"/>
-                <w:szCs w:val="18"/>
+                <w:sz w:val="20"/>
+                <w:szCs w:val="20"/>
               </w:rPr>
               <w:t xml:space="preserve">Role</w:t>
             </w:r>
@@ -164,8 +166,8 @@
               <w:rPr>
                 <w:b/>
                 <w:bCs/>
-                <w:sz w:val="18"/>
-                <w:szCs w:val="18"/>
+                <w:sz w:val="20"/>
+                <w:szCs w:val="20"/>
               </w:rPr>
               <w:t xml:space="preserve">Tools</w:t>
             </w:r>
@@ -193,8 +195,8 @@
               <w:rPr>
                 <w:b/>
                 <w:bCs/>
-                <w:sz w:val="18"/>
-                <w:szCs w:val="18"/>
+                <w:sz w:val="20"/>
+                <w:szCs w:val="20"/>
               </w:rPr>
               <w:t xml:space="preserve">Model</w:t>
             </w:r>
@@ -221,8 +223,8 @@
           <w:p>
             <w:r>
               <w:rPr>
-                <w:sz w:val="18"/>
-                <w:szCs w:val="18"/>
+                <w:sz w:val="20"/>
+                <w:szCs w:val="20"/>
               </w:rPr>
               <w:t xml:space="preserve">Planner</w:t>
             </w:r>
@@ -247,8 +249,8 @@
           <w:p>
             <w:r>
               <w:rPr>
-                <w:sz w:val="18"/>
-                <w:szCs w:val="18"/>
+                <w:sz w:val="20"/>
+                <w:szCs w:val="20"/>
               </w:rPr>
               <w:t xml:space="preserve">Decompose user query into ≤5 sub-questions</w:t>
             </w:r>
@@ -273,8 +275,8 @@
           <w:p>
             <w:r>
               <w:rPr>
-                <w:sz w:val="18"/>
-                <w:szCs w:val="18"/>
+                <w:sz w:val="20"/>
+                <w:szCs w:val="20"/>
               </w:rPr>
               <w:t xml:space="preserve">none</w:t>
             </w:r>
@@ -299,8 +301,8 @@
           <w:p>
             <w:r>
               <w:rPr>
-                <w:sz w:val="18"/>
-                <w:szCs w:val="18"/>
+                <w:sz w:val="20"/>
+                <w:szCs w:val="20"/>
               </w:rPr>
               <w:t xml:space="preserve">Claude Sonnet</w:t>
             </w:r>
@@ -327,8 +329,8 @@
           <w:p>
             <w:r>
               <w:rPr>
-                <w:sz w:val="18"/>
-                <w:szCs w:val="18"/>
+                <w:sz w:val="20"/>
+                <w:szCs w:val="20"/>
               </w:rPr>
               <w:t xml:space="preserve">Researcher (×N)</w:t>
             </w:r>
@@ -353,8 +355,8 @@
           <w:p>
             <w:r>
               <w:rPr>
-                <w:sz w:val="18"/>
-                <w:szCs w:val="18"/>
+                <w:sz w:val="20"/>
+                <w:szCs w:val="20"/>
               </w:rPr>
               <w:t xml:space="preserve">Parallel web search + summarize per sub-Q</w:t>
             </w:r>
@@ -379,8 +381,8 @@
           <w:p>
             <w:r>
               <w:rPr>
-                <w:sz w:val="18"/>
-                <w:szCs w:val="18"/>
+                <w:sz w:val="20"/>
+                <w:szCs w:val="20"/>
               </w:rPr>
               <w:t xml:space="preserve">Tavily search (allowlisted)</w:t>
             </w:r>
@@ -405,8 +407,8 @@
           <w:p>
             <w:r>
               <w:rPr>
-                <w:sz w:val="18"/>
-                <w:szCs w:val="18"/>
+                <w:sz w:val="20"/>
+                <w:szCs w:val="20"/>
               </w:rPr>
               <w:t xml:space="preserve">Claude Sonnet</w:t>
             </w:r>
@@ -433,8 +435,8 @@
           <w:p>
             <w:r>
               <w:rPr>
-                <w:sz w:val="18"/>
-                <w:szCs w:val="18"/>
+                <w:sz w:val="20"/>
+                <w:szCs w:val="20"/>
               </w:rPr>
               <w:t xml:space="preserve">Writer</w:t>
             </w:r>
@@ -459,8 +461,8 @@
           <w:p>
             <w:r>
               <w:rPr>
-                <w:sz w:val="18"/>
-                <w:szCs w:val="18"/>
+                <w:sz w:val="20"/>
+                <w:szCs w:val="20"/>
               </w:rPr>
               <w:t xml:space="preserve">Synthesize sourced brief from findings</w:t>
             </w:r>
@@ -485,8 +487,8 @@
           <w:p>
             <w:r>
               <w:rPr>
-                <w:sz w:val="18"/>
-                <w:szCs w:val="18"/>
+                <w:sz w:val="20"/>
+                <w:szCs w:val="20"/>
               </w:rPr>
               <w:t xml:space="preserve">none</w:t>
             </w:r>
@@ -511,8 +513,8 @@
           <w:p>
             <w:r>
               <w:rPr>
-                <w:sz w:val="18"/>
-                <w:szCs w:val="18"/>
+                <w:sz w:val="20"/>
+                <w:szCs w:val="20"/>
               </w:rPr>
               <w:t xml:space="preserve">Claude Sonnet</w:t>
             </w:r>
@@ -539,8 +541,8 @@
           <w:p>
             <w:r>
               <w:rPr>
-                <w:sz w:val="18"/>
-                <w:szCs w:val="18"/>
+                <w:sz w:val="20"/>
+                <w:szCs w:val="20"/>
               </w:rPr>
               <w:t xml:space="preserve">Critic</w:t>
             </w:r>
@@ -565,8 +567,8 @@
           <w:p>
             <w:r>
               <w:rPr>
-                <w:sz w:val="18"/>
-                <w:szCs w:val="18"/>
+                <w:sz w:val="20"/>
+                <w:szCs w:val="20"/>
               </w:rPr>
               <w:t xml:space="preserve">Fact-check vs. sources; emit confidence score; loop if weak</w:t>
             </w:r>
@@ -591,8 +593,8 @@
           <w:p>
             <w:r>
               <w:rPr>
-                <w:sz w:val="18"/>
-                <w:szCs w:val="18"/>
+                <w:sz w:val="20"/>
+                <w:szCs w:val="20"/>
               </w:rPr>
               <w:t xml:space="preserve">none</w:t>
             </w:r>
@@ -617,8 +619,8 @@
           <w:p>
             <w:r>
               <w:rPr>
-                <w:sz w:val="18"/>
-                <w:szCs w:val="18"/>
+                <w:sz w:val="20"/>
+                <w:szCs w:val="20"/>
               </w:rPr>
               <w:t xml:space="preserve">Claude Sonnet</w:t>
             </w:r>
@@ -645,8 +647,8 @@
           <w:p>
             <w:r>
               <w:rPr>
-                <w:sz w:val="18"/>
-                <w:szCs w:val="18"/>
+                <w:sz w:val="20"/>
+                <w:szCs w:val="20"/>
               </w:rPr>
               <w:t xml:space="preserve">Security</w:t>
             </w:r>
@@ -671,8 +673,8 @@
           <w:p>
             <w:r>
               <w:rPr>
-                <w:sz w:val="18"/>
-                <w:szCs w:val="18"/>
+                <w:sz w:val="20"/>
+                <w:szCs w:val="20"/>
               </w:rPr>
               <w:t xml:space="preserve">Input / web-content / output checkpoints</w:t>
             </w:r>
@@ -697,8 +699,8 @@
           <w:p>
             <w:r>
               <w:rPr>
-                <w:sz w:val="18"/>
-                <w:szCs w:val="18"/>
+                <w:sz w:val="20"/>
+                <w:szCs w:val="20"/>
               </w:rPr>
               <w:t xml:space="preserve">regex + LLM judge</w:t>
             </w:r>
@@ -723,8 +725,8 @@
           <w:p>
             <w:r>
               <w:rPr>
-                <w:sz w:val="18"/>
-                <w:szCs w:val="18"/>
+                <w:sz w:val="20"/>
+                <w:szCs w:val="20"/>
               </w:rPr>
               <w:t xml:space="preserve">Claude Haiku</w:t>
             </w:r>
@@ -742,7 +744,8 @@
     </w:p>
     <w:p>
       <w:pPr>
-        <w:spacing w:after="80"/>
+        <w:spacing w:after="130" w:line="264"/>
+        <w:jc w:val="both"/>
       </w:pPr>
       <w:r>
         <w:rPr>
@@ -772,12 +775,13 @@
         <w:t xml:space="preserve">findings</w:t>
       </w:r>
       <w:r>
-        <w:t xml:space="preserve"> field uses a list-merge reducer so parallel Researcher writes don’t race. Agents never call each other directly — the graph router controls every transition.</w:t>
-      </w:r>
-    </w:p>
-    <w:p>
-      <w:pPr>
-        <w:spacing w:after="80"/>
+        <w:t xml:space="preserve"> field uses a list-merge reducer so parallel Researcher writes don’t race. Agents never call each other directly; the graph router controls every transition.</w:t>
+      </w:r>
+    </w:p>
+    <w:p>
+      <w:pPr>
+        <w:spacing w:after="130" w:line="264"/>
+        <w:jc w:val="both"/>
       </w:pPr>
       <w:r>
         <w:rPr>
@@ -800,10 +804,11 @@
     </w:p>
     <w:p>
       <w:pPr>
-        <w:spacing w:after="80"/>
-      </w:pPr>
-      <w:r>
-        <w:t xml:space="preserve">The dominant threat for a research agent is not user prompt injection — it is </w:t>
+        <w:spacing w:after="130" w:line="264"/>
+        <w:jc w:val="both"/>
+      </w:pPr>
+      <w:r>
+        <w:t xml:space="preserve">The dominant threat for a research agent is not user prompt injection; it is </w:t>
       </w:r>
       <w:r>
         <w:rPr>
@@ -823,7 +828,8 @@
           <w:ilvl w:val="0"/>
           <w:numId w:val="2"/>
         </w:numPr>
-        <w:spacing w:after="40"/>
+        <w:spacing w:after="90" w:line="264"/>
+        <w:jc w:val="both"/>
       </w:pPr>
       <w:r>
         <w:rPr>
@@ -843,7 +849,8 @@
           <w:ilvl w:val="0"/>
           <w:numId w:val="2"/>
         </w:numPr>
-        <w:spacing w:after="40"/>
+        <w:spacing w:after="90" w:line="264"/>
+        <w:jc w:val="both"/>
       </w:pPr>
       <w:r>
         <w:rPr>
@@ -863,7 +870,8 @@
           <w:ilvl w:val="0"/>
           <w:numId w:val="2"/>
         </w:numPr>
-        <w:spacing w:after="40"/>
+        <w:spacing w:after="90" w:line="264"/>
+        <w:jc w:val="both"/>
       </w:pPr>
       <w:r>
         <w:rPr>
@@ -878,7 +886,8 @@
     </w:p>
     <w:p>
       <w:pPr>
-        <w:spacing w:after="80"/>
+        <w:spacing w:after="130" w:line="264"/>
+        <w:jc w:val="both"/>
       </w:pPr>
       <w:r>
         <w:rPr>
@@ -898,7 +907,7 @@
         <w:t xml:space="preserve">Tool allowlisting</w:t>
       </w:r>
       <w:r>
-        <w:t xml:space="preserve"> — only the Researcher module imports the Tavily client; no agent has shell, raw HTTP, or filesystem access. (2) </w:t>
+        <w:t xml:space="preserve">: only the Researcher module imports the Tavily client; no agent has shell, raw HTTP, or filesystem access. (2) </w:t>
       </w:r>
       <w:r>
         <w:rPr>
@@ -908,7 +917,7 @@
         <w:t xml:space="preserve">Hard budget caps</w:t>
       </w:r>
       <w:r>
-        <w:t xml:space="preserve"> loaded from config — ≤5 sub-questions, ≤10 search calls, ≤1 critic retry, 4k tokens/agent, 120s request timeout. (3) </w:t>
+        <w:t xml:space="preserve"> loaded from config: ≤5 sub-questions, ≤10 search calls, ≤1 critic retry, 4k tokens/agent, 120s request timeout. (3) </w:t>
       </w:r>
       <w:r>
         <w:rPr>
@@ -928,7 +937,7 @@
         <w:t xml:space="preserve">Container hardening</w:t>
       </w:r>
       <w:r>
-        <w:t xml:space="preserve"> — the Docker image runs as a non-root user; secrets are injected as Lightsail environment variables, never committed (.env is git-ignored).</w:t>
+        <w:t xml:space="preserve">: the Docker image runs as a non-root user; secrets are injected as Lightsail environment variables, never committed (.env is git-ignored).</w:t>
       </w:r>
     </w:p>
     <w:p>
@@ -941,7 +950,8 @@
     </w:p>
     <w:p>
       <w:pPr>
-        <w:spacing w:after="80"/>
+        <w:spacing w:after="130" w:line="264"/>
+        <w:jc w:val="both"/>
       </w:pPr>
       <w:r>
         <w:rPr>
@@ -956,7 +966,8 @@
     </w:p>
     <w:p>
       <w:pPr>
-        <w:spacing w:after="80"/>
+        <w:spacing w:after="130" w:line="264"/>
+        <w:jc w:val="both"/>
       </w:pPr>
       <w:r>
         <w:rPr>
@@ -966,12 +977,13 @@
         <w:t xml:space="preserve">Why LangGraph: </w:t>
       </w:r>
       <w:r>
-        <w:t xml:space="preserve">the explicit graph makes the architecture diagram and the audit trail line up exactly, parallelism is a first-class concept (Send), and security checkpoints are nodes — not middleware bolted on. CrewAI and AutoGen are higher-level but obscure exactly the control-flow story this assignment asks for.</w:t>
-      </w:r>
-    </w:p>
-    <w:p>
-      <w:pPr>
-        <w:spacing w:after="80"/>
+        <w:t xml:space="preserve">the explicit graph makes the architecture diagram and the audit trail line up exactly, parallelism is a first-class concept (Send), and security checkpoints are nodes, not middleware bolted on. CrewAI and AutoGen are higher-level but obscure exactly the control-flow story this assignment asks for.</w:t>
+      </w:r>
+    </w:p>
+    <w:p>
+      <w:pPr>
+        <w:spacing w:after="130" w:line="264"/>
+        <w:jc w:val="both"/>
       </w:pPr>
       <w:r>
         <w:rPr>
@@ -986,7 +998,8 @@
     </w:p>
     <w:p>
       <w:pPr>
-        <w:spacing w:after="80"/>
+        <w:spacing w:after="130" w:line="264"/>
+        <w:jc w:val="both"/>
       </w:pPr>
       <w:r>
         <w:rPr>
@@ -996,12 +1009,13 @@
         <w:t xml:space="preserve">Errors / retries: </w:t>
       </w:r>
       <w:r>
-        <w:t xml:space="preserve">LLM calls go through a single wrapper with tenacity exponential backoff on transient errors (rate-limit, timeout, 5xx). JSON parsing failures degrade gracefully to a tagged error object so downstream nodes can route. Search-tool failures yield an empty SubFinding with a reason — the run continues with whatever remains.</w:t>
-      </w:r>
-    </w:p>
-    <w:p>
-      <w:pPr>
-        <w:spacing w:after="80"/>
+        <w:t xml:space="preserve">LLM calls go through a single wrapper with tenacity exponential backoff on transient errors (rate-limit, timeout, 5xx). JSON parsing failures degrade gracefully to a tagged error object so downstream nodes can route. Search-tool failures yield an empty SubFinding with a reason, so the run continues with whatever remains.</w:t>
+      </w:r>
+    </w:p>
+    <w:p>
+      <w:pPr>
+        <w:spacing w:after="130" w:line="264"/>
+        <w:jc w:val="both"/>
       </w:pPr>
       <w:r>
         <w:rPr>
@@ -1016,7 +1030,8 @@
     </w:p>
     <w:p>
       <w:pPr>
-        <w:spacing w:after="80"/>
+        <w:spacing w:after="130" w:line="264"/>
+        <w:jc w:val="both"/>
       </w:pPr>
       <w:r>
         <w:rPr>
@@ -1039,7 +1054,8 @@
     </w:p>
     <w:p>
       <w:pPr>
-        <w:spacing w:after="80"/>
+        <w:spacing w:after="130" w:line="264"/>
+        <w:jc w:val="both"/>
       </w:pPr>
       <w:r>
         <w:rPr>
@@ -1064,7 +1080,8 @@
     </w:p>
     <w:p>
       <w:pPr>
-        <w:spacing w:after="80"/>
+        <w:spacing w:after="130" w:line="264"/>
+        <w:jc w:val="both"/>
       </w:pPr>
       <w:r>
         <w:rPr>
@@ -1074,12 +1091,13 @@
         <w:t xml:space="preserve">Collaboration / negotiation: </w:t>
       </w:r>
       <w:r>
-        <w:t xml:space="preserve">The Critic is an explicit adversarial peer to the Writer. If the Critic identifies more than one unsupported claim it loops back to the Writer with structured issues to address; if the second pass still has issues, the run proceeds but surfaces them to the user. The Critic also emits a 0–100 confidence score (weighing source grounding, source quantity and agreement, and issues found) that is shown alongside the brief — so the reader sees not just an answer but a calibrated trust signal. This negotiation is bounded — there is no free-form agent chat that could spiral.</w:t>
-      </w:r>
-    </w:p>
-    <w:p>
-      <w:pPr>
-        <w:spacing w:after="80"/>
+        <w:t xml:space="preserve">The Critic is an explicit adversarial peer to the Writer. If the Critic identifies more than one unsupported claim it loops back to the Writer with structured issues to address; if the second pass still has issues, the run proceeds but surfaces them to the user. The Critic also emits a 0 to 100 confidence score (weighing source grounding, source quantity and agreement, and issues found) that is shown alongside the brief, so the reader sees not just an answer but a calibrated trust signal. This negotiation is bounded; there is no free-form agent chat that could spiral.</w:t>
+      </w:r>
+    </w:p>
+    <w:p>
+      <w:pPr>
+        <w:spacing w:after="130" w:line="264"/>
+        <w:jc w:val="both"/>
       </w:pPr>
       <w:r>
         <w:rPr>
@@ -1089,7 +1107,7 @@
         <w:t xml:space="preserve">Autonomy vs. control: </w:t>
       </w:r>
       <w:r>
-        <w:t xml:space="preserve">Atlas deliberately sits at the low-autonomy end of the spectrum. Agents have narrow roles (one objective, one output schema), no tool choice (allowlist), and no memory across runs. The trade-off is less emergent behavior on truly novel queries — accepted because the use case rewards reliability, auditability, and safety over open-ended exploration. The same skeleton (typed state, allowlisted tools, layered guardrails, capped loops) is what scales to higher-stakes domains.</w:t>
+        <w:t xml:space="preserve">Atlas deliberately sits at the low-autonomy end of the spectrum. Agents have narrow roles (one objective, one output schema), no tool choice (allowlist), and no memory across runs. The trade-off is less emergent behavior on truly novel queries, accepted because the use case rewards reliability, auditability, and safety over open-ended exploration. The same skeleton (typed state, allowlisted tools, layered guardrails, capped loops) is what scales to higher-stakes domains.</w:t>
       </w:r>
     </w:p>
     <w:p>
@@ -1100,15 +1118,15 @@
         <w:rPr>
           <w:b/>
           <w:bCs/>
-          <w:sz w:val="18"/>
-          <w:szCs w:val="18"/>
+          <w:sz w:val="20"/>
+          <w:szCs w:val="20"/>
         </w:rPr>
         <w:t xml:space="preserve">Repository: </w:t>
       </w:r>
       <w:r>
         <w:rPr>
-          <w:sz w:val="18"/>
-          <w:szCs w:val="18"/>
+          <w:sz w:val="20"/>
+          <w:szCs w:val="20"/>
         </w:rPr>
         <w:t xml:space="preserve">github.com/manasimathkar/atlas-multi-agent     </w:t>
       </w:r>
@@ -1116,15 +1134,15 @@
         <w:rPr>
           <w:b/>
           <w:bCs/>
-          <w:sz w:val="18"/>
-          <w:szCs w:val="18"/>
+          <w:sz w:val="20"/>
+          <w:szCs w:val="20"/>
         </w:rPr>
         <w:t xml:space="preserve">Live demo: </w:t>
       </w:r>
       <w:r>
         <w:rPr>
-          <w:sz w:val="18"/>
-          <w:szCs w:val="18"/>
+          <w:sz w:val="20"/>
+          <w:szCs w:val="20"/>
         </w:rPr>
         <w:t xml:space="preserve">wipro-manasi.jc3b1dk9p8244.us-west-2.cs.amazonlightsail.com</w:t>
       </w:r>
@@ -1195,7 +1213,7 @@
         <w:sz w:val="16"/>
         <w:szCs w:val="16"/>
       </w:rPr>
-      <w:t xml:space="preserve">Atlas — Multi-Agent Research &amp; Brief Generator</w:t>
+      <w:t xml:space="preserve">Atlas: Multi-Agent Research &amp; Brief Generator</w:t>
     </w:r>
     <w:r>
       <w:rPr>

</xml_diff>